<commit_message>
feat(documentos): fecha de firma elegible y versiones del contrato de domicilio
- Campo «Fecha de firma» en el formulario (por defecto, hoy).
- Cada descarga con datos distintos se guarda como versión (ContratoDomicilioVersion);
  el formulario abre con la última y deja volver a una anterior o a los datos del trámite.
- Se quita «Versión octubre 2026» del encabezado (Word y PDF).

Co-Authored-By: Claude Opus 5.5 <noreply@anthropic.com>
</commit_message>
<xml_diff>
--- a/lib/plantillas/contrato-domicilio.docx
+++ b/lib/plantillas/contrato-domicilio.docx
@@ -86,19 +86,6 @@
                 <w:spacing w:val="20"/>
               </w:rPr>
               <w:t>PLAN DOMICILIO SAS</w:t>
-            </w:r>
-            <w:r>
-              <w:br/>
-            </w:r>
-            <w:r>
-              <w:rPr>
-                <w:rFonts w:ascii="Arial" w:hAnsi="Arial" w:eastAsia="Arial"/>
-                <w:b w:val="0"/>
-                <w:i w:val="0"/>
-                <w:color w:val="6B6B6B"/>
-                <w:sz w:val="17"/>
-              </w:rPr>
-              <w:t>Versión octubre 2026</w:t>
             </w:r>
           </w:p>
         </w:tc>

</xml_diff>

<commit_message>
feat(domicilios): seguimiento del BCRA de clientes con domicilio en sede
Consulta la Central de Deudores (deudas, 24 meses y cheques rechazados) de la
sociedad, socios y administradores: antes de aceptar, al activar y todos los
meses. Semáforo e informe en Domicilios, mail a los admins si alguien empeora
y cláusula de consentimiento en el contrato (a revisar por el estudio).

Co-Authored-By: Claude Opus 5.5 <noreply@anthropic.com>
</commit_message>
<xml_diff>
--- a/lib/plantillas/contrato-domicilio.docx
+++ b/lib/plantillas/contrato-domicilio.docx
@@ -1765,6 +1765,22 @@
     </w:p>
     <w:p>
       <w:pPr>
+        <w:spacing w:after="80" w:before="0" w:line="276" w:lineRule="auto"/>
+        <w:jc w:val="both"/>
+      </w:pPr>
+      <w:r>
+        <w:rPr>
+          <w:rFonts w:ascii="Arial" w:hAnsi="Arial" w:eastAsia="Arial"/>
+          <w:b w:val="0"/>
+          <w:i w:val="0"/>
+          <w:color w:val="1C1C1C"/>
+          <w:sz w:val="20"/>
+        </w:rPr>
+        <w:t xml:space="preserve">LA SOCIEDAD y EL COOBLIGADO autorizan a EL PRESTADOR a consultar, al contratar y durante toda la vigencia de este contrato, la situación crediticia de LA SOCIEDAD, de sus socios y de sus administradores en la Central de Deudores del Banco Central de la República Argentina y en otras bases públicas de información crediticia, con la única finalidad de evaluar la contratación y su renovación (art. 26, Ley N° 25.326). LA SOCIEDAD declara contar con la conformidad de sus socios y administradores para estas consultas.</w:t>
+      </w:r>
+    </w:p>
+    <w:p>
+      <w:pPr>
         <w:keepNext/>
         <w:spacing w:after="60" w:before="180" w:line="276" w:lineRule="auto"/>
         <w:jc w:val="left"/>

</xml_diff>